<commit_message>
Refactor for new functions set up
</commit_message>
<xml_diff>
--- a/Claude Prompts/Graph Discussion.docx
+++ b/Claude Prompts/Graph Discussion.docx
@@ -7,29 +7,93 @@
         <w:pStyle w:val="ListParagraph"/>
         <w:numPr>
           <w:ilvl w:val="0"/>
-          <w:numId w:val="1"/>
+          <w:numId w:val="3"/>
         </w:numPr>
       </w:pPr>
       <w:r>
-        <w:t>I</w:t>
-      </w:r>
-      <w:r>
-        <w:t xml:space="preserve"> am simulating networks where the number of edges between the initial nodes</w:t>
-      </w:r>
-      <w:r>
-        <w:t>, m,</w:t>
-      </w:r>
-      <w:r>
-        <w:t xml:space="preserve"> and number of initial nodes</w:t>
-      </w:r>
-      <w:r>
-        <w:t>, n_0,</w:t>
-      </w:r>
-      <w:r>
-        <w:t xml:space="preserve"> are exogenous parameters. I</w:t>
-      </w:r>
-      <w:r>
-        <w:t xml:space="preserve"> also have a theoretical distribution for the result of each one. I have a meticulously thought out KS test process to generate bootstrapped sort of P value adjacent statistics for each theory-network pair. I want to investigate whether my theory is correct up to a given data truncation avoiding finite size effect large in-degree nodes and  that this is dependent on the set up of the initial network. </w:t>
+        <w:t xml:space="preserve">Note how this code is set up for our adaptation on a yule </w:t>
+      </w:r>
+      <w:r>
+        <w:t>Simon</w:t>
+      </w:r>
+      <w:r>
+        <w:t xml:space="preserve"> as the theoretical function</w:t>
+      </w:r>
+      <w:r>
+        <w:t xml:space="preserve">. I want to allow the code to also be able to consider </w:t>
+      </w:r>
+      <w:r>
+        <w:t xml:space="preserve">other functional theoretical forms; to be </w:t>
+      </w:r>
+      <w:proofErr w:type="spellStart"/>
+      <w:r>
+        <w:t>spefific</w:t>
+      </w:r>
+      <w:proofErr w:type="spellEnd"/>
+      <w:r>
+        <w:t xml:space="preserve"> two types of decaying power law</w:t>
+      </w:r>
+      <w:r>
+        <w:t xml:space="preserve">. As far as I can tell the </w:t>
+      </w:r>
+      <w:proofErr w:type="spellStart"/>
+      <w:r>
+        <w:t>g.o.f</w:t>
+      </w:r>
+      <w:proofErr w:type="spellEnd"/>
+      <w:r>
+        <w:t xml:space="preserve"> class should be fine with this as it just takes the theory function as if its anything and works with this. as for the </w:t>
+      </w:r>
+      <w:r>
+        <w:t>directed homo</w:t>
+      </w:r>
+      <w:r>
+        <w:t>philic one, the network vis produces</w:t>
+      </w:r>
+      <w:r>
+        <w:t>, for example,</w:t>
+      </w:r>
+      <w:r>
+        <w:t xml:space="preserve"> a normalisation and asymptotes unique to our theor</w:t>
+      </w:r>
+      <w:r>
+        <w:t>etical function</w:t>
+      </w:r>
+      <w:r>
+        <w:t xml:space="preserve"> so in order to stop the code crashing I’m thinking </w:t>
+      </w:r>
+      <w:r>
+        <w:t xml:space="preserve">ill </w:t>
+      </w:r>
+      <w:r>
+        <w:t xml:space="preserve">create a nested class in network vis for these </w:t>
+      </w:r>
+      <w:proofErr w:type="spellStart"/>
+      <w:r>
+        <w:t>newro</w:t>
+      </w:r>
+      <w:proofErr w:type="spellEnd"/>
+      <w:r>
+        <w:t xml:space="preserve"> </w:t>
+      </w:r>
+      <w:proofErr w:type="spellStart"/>
+      <w:r>
+        <w:t>kvis</w:t>
+      </w:r>
+      <w:proofErr w:type="spellEnd"/>
+      <w:r>
+        <w:t xml:space="preserve"> </w:t>
+      </w:r>
+      <w:proofErr w:type="spellStart"/>
+      <w:r>
+        <w:t>spefific</w:t>
+      </w:r>
+      <w:proofErr w:type="spellEnd"/>
+      <w:r>
+        <w:t xml:space="preserve"> functions</w:t>
+      </w:r>
+      <w:r>
+        <w:t xml:space="preserve"> and as this is a bit tidier if we continue to develop this codebase. Perhaps a nested class for these power laws is tidier but my gut says no. </w:t>
       </w:r>
     </w:p>
     <w:p>
@@ -37,11 +101,36 @@
         <w:pStyle w:val="ListParagraph"/>
         <w:numPr>
           <w:ilvl w:val="0"/>
-          <w:numId w:val="1"/>
+          <w:numId w:val="3"/>
         </w:numPr>
       </w:pPr>
       <w:r>
-        <w:t xml:space="preserve">I want to generate plots of this process to showcase my empirical findings: I am entirely happy with my analytic theory, p-value generation and choice of m and n_0. My problem is that what I have is a dependent axis of p-values dependent on the data truncation, m and n_0 choices. This is a volume that sits in 4d space. </w:t>
+        <w:t>I’m</w:t>
+      </w:r>
+      <w:r>
+        <w:t xml:space="preserve"> also thinking we set this up in the main.py with a new </w:t>
+      </w:r>
+      <w:proofErr w:type="spellStart"/>
+      <w:r>
+        <w:t>dict</w:t>
+      </w:r>
+      <w:proofErr w:type="spellEnd"/>
+      <w:r>
+        <w:t xml:space="preserve"> that determines whether our analysis should be performed on the current or the new distribution. We’ll also need to think about, for the </w:t>
+      </w:r>
+      <w:proofErr w:type="spellStart"/>
+      <w:r>
+        <w:t>g.o.f</w:t>
+      </w:r>
+      <w:proofErr w:type="spellEnd"/>
+      <w:r>
+        <w:t xml:space="preserve"> what the order of operation looks like if both are set to true. Is this worth </w:t>
+      </w:r>
+      <w:r>
+        <w:t xml:space="preserve">it? </w:t>
+      </w:r>
+      <w:r>
+        <w:t xml:space="preserve">or should we just let this class only take one theoretical function in a t a time? </w:t>
       </w:r>
     </w:p>
     <w:p>
@@ -49,30 +138,22 @@
         <w:pStyle w:val="ListParagraph"/>
         <w:numPr>
           <w:ilvl w:val="0"/>
-          <w:numId w:val="1"/>
+          <w:numId w:val="3"/>
         </w:numPr>
       </w:pPr>
       <w:r>
-        <w:t xml:space="preserve">Given what I want to show is how this initial edge density impacts the range over which we can consider our theory accurate how should I go about plotting this. I’ve always struggled with the idea of some chosen </w:t>
+        <w:t>If the directed homophilic is set to both I defo want plots that can have both theory lines on to have both theory lines on (</w:t>
       </w:r>
       <w:proofErr w:type="spellStart"/>
       <w:r>
-        <w:t>p_c</w:t>
+        <w:t>i.e</w:t>
       </w:r>
       <w:proofErr w:type="spellEnd"/>
       <w:r>
-        <w:t xml:space="preserve"> based on significance,</w:t>
-      </w:r>
-      <w:r>
-        <w:t xml:space="preserve">. I understand why it is done and I don’t wish to discuss this </w:t>
-      </w:r>
-      <w:proofErr w:type="spellStart"/>
-      <w:r>
-        <w:t>p_c</w:t>
-      </w:r>
-      <w:proofErr w:type="spellEnd"/>
-      <w:r>
-        <w:t xml:space="preserve"> idea further currently. </w:t>
+        <w:t xml:space="preserve"> on the same plot)</w:t>
+      </w:r>
+      <w:r>
+        <w:t>.</w:t>
       </w:r>
     </w:p>
     <w:p>
@@ -80,27 +161,50 @@
         <w:pStyle w:val="ListParagraph"/>
         <w:numPr>
           <w:ilvl w:val="0"/>
-          <w:numId w:val="1"/>
+          <w:numId w:val="3"/>
         </w:numPr>
       </w:pPr>
       <w:r>
-        <w:t xml:space="preserve">There are a few ideas </w:t>
+        <w:t xml:space="preserve">My initial thoughts </w:t>
+      </w:r>
+      <w:r>
+        <w:t xml:space="preserve">are to </w:t>
+      </w:r>
+      <w:r>
+        <w:t xml:space="preserve">set up the </w:t>
+      </w:r>
+      <w:r>
+        <w:t>“</w:t>
+      </w:r>
+      <w:r>
+        <w:t>if network basic</w:t>
+      </w:r>
+      <w:r>
+        <w:t xml:space="preserve">2 to be able to handle each theory function and the cumulative theory functions, and as for the </w:t>
       </w:r>
       <w:proofErr w:type="spellStart"/>
       <w:r>
-        <w:t>ive</w:t>
+        <w:t>g.o.f</w:t>
       </w:r>
       <w:proofErr w:type="spellEnd"/>
       <w:r>
-        <w:t xml:space="preserve"> had such as: a) turn m and n0 into a density parameter which is just (m/n0) as one axis, have the data truncation range as another axis and contour plot the p-value on top. b) plot p vs m with P(R = x), P(R = y), P(R=z),… all on the plot with R being the truncation range and </w:t>
+        <w:t xml:space="preserve"> class, for minimum </w:t>
       </w:r>
       <w:proofErr w:type="spellStart"/>
       <w:r>
-        <w:t>x,y,z</w:t>
+        <w:t>faf</w:t>
       </w:r>
       <w:proofErr w:type="spellEnd"/>
       <w:r>
-        <w:t xml:space="preserve"> being different values. Then, do the same for p vs n0. Then, for each, construct contour plots. C) etc</w:t>
+        <w:t xml:space="preserve"> and refactoring, this has no both setting and we just </w:t>
+      </w:r>
+      <w:proofErr w:type="spellStart"/>
+      <w:r>
+        <w:t>g.o.g</w:t>
+      </w:r>
+      <w:proofErr w:type="spellEnd"/>
+      <w:r>
+        <w:t xml:space="preserve"> one function at a time. </w:t>
       </w:r>
     </w:p>
     <w:p>
@@ -108,60 +212,76 @@
         <w:pStyle w:val="ListParagraph"/>
         <w:numPr>
           <w:ilvl w:val="0"/>
-          <w:numId w:val="1"/>
+          <w:numId w:val="3"/>
         </w:numPr>
       </w:pPr>
       <w:r>
-        <w:t xml:space="preserve">Effectively, this is a combinatorics problem of the order I want to tell my narrative in, there is no one plot, one statistic that can reduce my data into a </w:t>
+        <w:t xml:space="preserve">As for the network statistics class and the file </w:t>
       </w:r>
       <w:proofErr w:type="spellStart"/>
       <w:r>
-        <w:t>takeway</w:t>
+        <w:t>maanger</w:t>
       </w:r>
       <w:proofErr w:type="spellEnd"/>
       <w:r>
-        <w:t>. It is just what plots to choose and what order to put them in.</w:t>
-      </w:r>
+        <w:t xml:space="preserve"> these </w:t>
+      </w:r>
+      <w:proofErr w:type="spellStart"/>
+      <w:r>
+        <w:t>eidts</w:t>
+      </w:r>
+      <w:proofErr w:type="spellEnd"/>
+      <w:r>
+        <w:t xml:space="preserve"> should be trivial so </w:t>
+      </w:r>
+      <w:proofErr w:type="spellStart"/>
+      <w:r>
+        <w:t>lets</w:t>
+      </w:r>
+      <w:proofErr w:type="spellEnd"/>
+      <w:r>
+        <w:t xml:space="preserve"> consider these later</w:t>
+      </w:r>
+    </w:p>
+    <w:p>
+      <w:r>
+        <w:t xml:space="preserve">Before a code response I want confirmation </w:t>
+      </w:r>
+      <w:proofErr w:type="spellStart"/>
+      <w:r>
+        <w:t>f</w:t>
+      </w:r>
+      <w:proofErr w:type="spellEnd"/>
+      <w:r>
+        <w:t xml:space="preserve"> understanding and your thoughts on this plan. </w:t>
+      </w:r>
+      <w:r>
+        <w:t xml:space="preserve"> </w:t>
+      </w:r>
+    </w:p>
+    <w:p>
+      <w:pPr>
+        <w:pStyle w:val="ListParagraph"/>
+      </w:pPr>
     </w:p>
     <w:p>
       <w:pPr>
         <w:pStyle w:val="ListParagraph"/>
         <w:numPr>
           <w:ilvl w:val="0"/>
-          <w:numId w:val="1"/>
+          <w:numId w:val="3"/>
         </w:numPr>
       </w:pPr>
       <w:r>
-        <w:t xml:space="preserve">As </w:t>
+        <w:t xml:space="preserve">I want to add a nested class to my directed homophilic Network class. I want this class to contain a method that plots a new curve on top of my log and linear distributions. This curve will be a </w:t>
       </w:r>
       <w:proofErr w:type="spellStart"/>
       <w:r>
-        <w:t>ive</w:t>
+        <w:t>concentional</w:t>
       </w:r>
       <w:proofErr w:type="spellEnd"/>
       <w:r>
-        <w:t xml:space="preserve"> got older </w:t>
-      </w:r>
-      <w:proofErr w:type="spellStart"/>
-      <w:r>
-        <w:t>ive</w:t>
-      </w:r>
-      <w:proofErr w:type="spellEnd"/>
-      <w:r>
-        <w:t xml:space="preserve"> come to think less is more on a plot and a series of understandable 2d plots put in thee right order is better than some </w:t>
-      </w:r>
-      <w:proofErr w:type="spellStart"/>
-      <w:r>
-        <w:t>colorful</w:t>
-      </w:r>
-      <w:proofErr w:type="spellEnd"/>
-      <w:r>
-        <w:t xml:space="preserve"> surface whose meaning is hard to intuit given how stochastic this process is and my desire to add error bars to the p-values.</w:t>
-      </w:r>
-    </w:p>
-    <w:p>
-      <w:r>
-        <w:t xml:space="preserve">I just need a second opinion. This typing process in itself was helpful. </w:t>
+        <w:t xml:space="preserve"> power law as opposed to a </w:t>
       </w:r>
     </w:p>
     <w:sectPr>
@@ -265,8 +385,192 @@
       </w:pPr>
     </w:lvl>
   </w:abstractNum>
+  <w:abstractNum w:abstractNumId="1" w15:restartNumberingAfterBreak="0">
+    <w:nsid w:val="560D69F4"/>
+    <w:multiLevelType w:val="hybridMultilevel"/>
+    <w:tmpl w:val="2BB2B7FE"/>
+    <w:lvl w:ilvl="0" w:tplc="0809000F">
+      <w:start w:val="1"/>
+      <w:numFmt w:val="decimal"/>
+      <w:lvlText w:val="%1."/>
+      <w:lvlJc w:val="left"/>
+      <w:pPr>
+        <w:ind w:left="720" w:hanging="360"/>
+      </w:pPr>
+      <w:rPr>
+        <w:rFonts w:hint="default"/>
+      </w:rPr>
+    </w:lvl>
+    <w:lvl w:ilvl="1" w:tplc="08090019" w:tentative="1">
+      <w:start w:val="1"/>
+      <w:numFmt w:val="lowerLetter"/>
+      <w:lvlText w:val="%2."/>
+      <w:lvlJc w:val="left"/>
+      <w:pPr>
+        <w:ind w:left="1440" w:hanging="360"/>
+      </w:pPr>
+    </w:lvl>
+    <w:lvl w:ilvl="2" w:tplc="0809001B" w:tentative="1">
+      <w:start w:val="1"/>
+      <w:numFmt w:val="lowerRoman"/>
+      <w:lvlText w:val="%3."/>
+      <w:lvlJc w:val="right"/>
+      <w:pPr>
+        <w:ind w:left="2160" w:hanging="180"/>
+      </w:pPr>
+    </w:lvl>
+    <w:lvl w:ilvl="3" w:tplc="0809000F" w:tentative="1">
+      <w:start w:val="1"/>
+      <w:numFmt w:val="decimal"/>
+      <w:lvlText w:val="%4."/>
+      <w:lvlJc w:val="left"/>
+      <w:pPr>
+        <w:ind w:left="2880" w:hanging="360"/>
+      </w:pPr>
+    </w:lvl>
+    <w:lvl w:ilvl="4" w:tplc="08090019" w:tentative="1">
+      <w:start w:val="1"/>
+      <w:numFmt w:val="lowerLetter"/>
+      <w:lvlText w:val="%5."/>
+      <w:lvlJc w:val="left"/>
+      <w:pPr>
+        <w:ind w:left="3600" w:hanging="360"/>
+      </w:pPr>
+    </w:lvl>
+    <w:lvl w:ilvl="5" w:tplc="0809001B" w:tentative="1">
+      <w:start w:val="1"/>
+      <w:numFmt w:val="lowerRoman"/>
+      <w:lvlText w:val="%6."/>
+      <w:lvlJc w:val="right"/>
+      <w:pPr>
+        <w:ind w:left="4320" w:hanging="180"/>
+      </w:pPr>
+    </w:lvl>
+    <w:lvl w:ilvl="6" w:tplc="0809000F" w:tentative="1">
+      <w:start w:val="1"/>
+      <w:numFmt w:val="decimal"/>
+      <w:lvlText w:val="%7."/>
+      <w:lvlJc w:val="left"/>
+      <w:pPr>
+        <w:ind w:left="5040" w:hanging="360"/>
+      </w:pPr>
+    </w:lvl>
+    <w:lvl w:ilvl="7" w:tplc="08090019" w:tentative="1">
+      <w:start w:val="1"/>
+      <w:numFmt w:val="lowerLetter"/>
+      <w:lvlText w:val="%8."/>
+      <w:lvlJc w:val="left"/>
+      <w:pPr>
+        <w:ind w:left="5760" w:hanging="360"/>
+      </w:pPr>
+    </w:lvl>
+    <w:lvl w:ilvl="8" w:tplc="0809001B" w:tentative="1">
+      <w:start w:val="1"/>
+      <w:numFmt w:val="lowerRoman"/>
+      <w:lvlText w:val="%9."/>
+      <w:lvlJc w:val="right"/>
+      <w:pPr>
+        <w:ind w:left="6480" w:hanging="180"/>
+      </w:pPr>
+    </w:lvl>
+  </w:abstractNum>
+  <w:abstractNum w:abstractNumId="2" w15:restartNumberingAfterBreak="0">
+    <w:nsid w:val="58E16D30"/>
+    <w:multiLevelType w:val="hybridMultilevel"/>
+    <w:tmpl w:val="88C2E440"/>
+    <w:lvl w:ilvl="0" w:tplc="0809000F">
+      <w:start w:val="1"/>
+      <w:numFmt w:val="decimal"/>
+      <w:lvlText w:val="%1."/>
+      <w:lvlJc w:val="left"/>
+      <w:pPr>
+        <w:ind w:left="720" w:hanging="360"/>
+      </w:pPr>
+      <w:rPr>
+        <w:rFonts w:hint="default"/>
+      </w:rPr>
+    </w:lvl>
+    <w:lvl w:ilvl="1" w:tplc="08090019" w:tentative="1">
+      <w:start w:val="1"/>
+      <w:numFmt w:val="lowerLetter"/>
+      <w:lvlText w:val="%2."/>
+      <w:lvlJc w:val="left"/>
+      <w:pPr>
+        <w:ind w:left="1440" w:hanging="360"/>
+      </w:pPr>
+    </w:lvl>
+    <w:lvl w:ilvl="2" w:tplc="0809001B" w:tentative="1">
+      <w:start w:val="1"/>
+      <w:numFmt w:val="lowerRoman"/>
+      <w:lvlText w:val="%3."/>
+      <w:lvlJc w:val="right"/>
+      <w:pPr>
+        <w:ind w:left="2160" w:hanging="180"/>
+      </w:pPr>
+    </w:lvl>
+    <w:lvl w:ilvl="3" w:tplc="0809000F" w:tentative="1">
+      <w:start w:val="1"/>
+      <w:numFmt w:val="decimal"/>
+      <w:lvlText w:val="%4."/>
+      <w:lvlJc w:val="left"/>
+      <w:pPr>
+        <w:ind w:left="2880" w:hanging="360"/>
+      </w:pPr>
+    </w:lvl>
+    <w:lvl w:ilvl="4" w:tplc="08090019" w:tentative="1">
+      <w:start w:val="1"/>
+      <w:numFmt w:val="lowerLetter"/>
+      <w:lvlText w:val="%5."/>
+      <w:lvlJc w:val="left"/>
+      <w:pPr>
+        <w:ind w:left="3600" w:hanging="360"/>
+      </w:pPr>
+    </w:lvl>
+    <w:lvl w:ilvl="5" w:tplc="0809001B" w:tentative="1">
+      <w:start w:val="1"/>
+      <w:numFmt w:val="lowerRoman"/>
+      <w:lvlText w:val="%6."/>
+      <w:lvlJc w:val="right"/>
+      <w:pPr>
+        <w:ind w:left="4320" w:hanging="180"/>
+      </w:pPr>
+    </w:lvl>
+    <w:lvl w:ilvl="6" w:tplc="0809000F" w:tentative="1">
+      <w:start w:val="1"/>
+      <w:numFmt w:val="decimal"/>
+      <w:lvlText w:val="%7."/>
+      <w:lvlJc w:val="left"/>
+      <w:pPr>
+        <w:ind w:left="5040" w:hanging="360"/>
+      </w:pPr>
+    </w:lvl>
+    <w:lvl w:ilvl="7" w:tplc="08090019" w:tentative="1">
+      <w:start w:val="1"/>
+      <w:numFmt w:val="lowerLetter"/>
+      <w:lvlText w:val="%8."/>
+      <w:lvlJc w:val="left"/>
+      <w:pPr>
+        <w:ind w:left="5760" w:hanging="360"/>
+      </w:pPr>
+    </w:lvl>
+    <w:lvl w:ilvl="8" w:tplc="0809001B" w:tentative="1">
+      <w:start w:val="1"/>
+      <w:numFmt w:val="lowerRoman"/>
+      <w:lvlText w:val="%9."/>
+      <w:lvlJc w:val="right"/>
+      <w:pPr>
+        <w:ind w:left="6480" w:hanging="180"/>
+      </w:pPr>
+    </w:lvl>
+  </w:abstractNum>
   <w:num w:numId="1" w16cid:durableId="1274939681">
     <w:abstractNumId w:val="0"/>
+  </w:num>
+  <w:num w:numId="2" w16cid:durableId="240524257">
+    <w:abstractNumId w:val="2"/>
+  </w:num>
+  <w:num w:numId="3" w16cid:durableId="142620709">
+    <w:abstractNumId w:val="1"/>
   </w:num>
 </w:numbering>
 </file>

</xml_diff>